<commit_message>
P247-P249 + judging pipeline: P247 late-window probe (outcome decidable at ep1000, r=0.854; event window 400-1000; 10 seeds replicate P243 exactly); P248 transfer premium CONFIRMED (numeric evidence transfers, 5 vs 27 transfer errors; rich3 errors grow across windows, rich10 shrink; evidence hierarchy three-tier); P249 Proposition 4 formalized (info cap + history non-accumulation + fiber indistinguishability + cache realizability + regime corollary); P242 erratum amended (page item order 15/18/19 also differed from key; scoring was page-based, unaffected); judge_answers.py added and validated against the pilot; exam page order aligned to key, materials regenerated
</commit_message>
<xml_diff>
--- a/g2b_package/考页.docx
+++ b/g2b_package/考页.docx
@@ -2422,7 +2422,7 @@
                 <w:sz w:val="24"/>
                 <w:szCs w:val="24"/>
               </w:rPr>
-              <w:t xml:space="preserve">★1■</w:t>
+              <w:t xml:space="preserve">★1●</w:t>
             </w:r>
           </w:p>
         </w:tc>
@@ -2650,7 +2650,7 @@
                 <w:sz w:val="24"/>
                 <w:szCs w:val="24"/>
               </w:rPr>
-              <w:t xml:space="preserve">■1▼</w:t>
+              <w:t xml:space="preserve">★1■</w:t>
             </w:r>
           </w:p>
         </w:tc>
@@ -2726,7 +2726,7 @@
                 <w:sz w:val="24"/>
                 <w:szCs w:val="24"/>
               </w:rPr>
-              <w:t xml:space="preserve">★1●</w:t>
+              <w:t xml:space="preserve">■1▼</w:t>
             </w:r>
           </w:p>
         </w:tc>

</xml_diff>